<commit_message>
changed the scenario modes into instantiatable prefabs for ease of use, revamped the players hud by fixing it to the bike handlebars after feedback from peers said that clued to the eyes would cause motion sickness or be distressing during hard efforts, also implemented the ability to return to tutorial as well as hide user data if user prefers it that way.
</commit_message>
<xml_diff>
--- a/Loose Info.docx
+++ b/Loose Info.docx
@@ -18,17 +18,12 @@
       </w:hyperlink>
     </w:p>
     <w:p>
-      <w:proofErr w:type="spellStart"/>
       <w:r>
-        <w:t>LowPoly</w:t>
-      </w:r>
-      <w:proofErr w:type="spellEnd"/>
-      <w:r>
-        <w:t xml:space="preserve"> Humanoid Model</w:t>
+        <w:t>LowPoly Humanoid Model</w:t>
       </w:r>
     </w:p>
     <w:p>
-      <w:hyperlink r:id="rId5" w:history="1">
+      <w:hyperlink r:id="rId5" w:anchor="download" w:history="1">
         <w:r>
           <w:rPr>
             <w:rStyle w:val="Hyperlink"/>
@@ -38,6 +33,88 @@
       </w:hyperlink>
       <w:r>
         <w:t xml:space="preserve"> </w:t>
+      </w:r>
+    </w:p>
+    <w:p>
+      <w:r>
+        <w:rPr>
+          <w:noProof/>
+        </w:rPr>
+        <w:drawing>
+          <wp:inline distT="0" distB="0" distL="0" distR="0" wp14:anchorId="71B7529A" wp14:editId="360B459C">
+            <wp:extent cx="5731510" cy="3104515"/>
+            <wp:effectExtent l="0" t="0" r="2540" b="635"/>
+            <wp:docPr id="1852868628" name="Picture 1" descr="A computer screen shot of a green and blue object&#10;&#10;AI-generated content may be incorrect."/>
+            <wp:cNvGraphicFramePr>
+              <a:graphicFrameLocks xmlns:a="http://schemas.openxmlformats.org/drawingml/2006/main" noChangeAspect="1"/>
+            </wp:cNvGraphicFramePr>
+            <a:graphic xmlns:a="http://schemas.openxmlformats.org/drawingml/2006/main">
+              <a:graphicData uri="http://schemas.openxmlformats.org/drawingml/2006/picture">
+                <pic:pic xmlns:pic="http://schemas.openxmlformats.org/drawingml/2006/picture">
+                  <pic:nvPicPr>
+                    <pic:cNvPr id="1852868628" name="Picture 1" descr="A computer screen shot of a green and blue object&#10;&#10;AI-generated content may be incorrect."/>
+                    <pic:cNvPicPr/>
+                  </pic:nvPicPr>
+                  <pic:blipFill>
+                    <a:blip r:embed="rId6"/>
+                    <a:stretch>
+                      <a:fillRect/>
+                    </a:stretch>
+                  </pic:blipFill>
+                  <pic:spPr>
+                    <a:xfrm>
+                      <a:off x="0" y="0"/>
+                      <a:ext cx="5731510" cy="3104515"/>
+                    </a:xfrm>
+                    <a:prstGeom prst="rect">
+                      <a:avLst/>
+                    </a:prstGeom>
+                  </pic:spPr>
+                </pic:pic>
+              </a:graphicData>
+            </a:graphic>
+          </wp:inline>
+        </w:drawing>
+      </w:r>
+      <w:r>
+        <w:rPr>
+          <w:noProof/>
+        </w:rPr>
+        <w:drawing>
+          <wp:inline distT="0" distB="0" distL="0" distR="0" wp14:anchorId="362CC802" wp14:editId="77641B26">
+            <wp:extent cx="5731510" cy="3157855"/>
+            <wp:effectExtent l="0" t="0" r="2540" b="4445"/>
+            <wp:docPr id="1789299765" name="Picture 1" descr="A computer screen shot of a green bicycle&#10;&#10;AI-generated content may be incorrect."/>
+            <wp:cNvGraphicFramePr>
+              <a:graphicFrameLocks xmlns:a="http://schemas.openxmlformats.org/drawingml/2006/main" noChangeAspect="1"/>
+            </wp:cNvGraphicFramePr>
+            <a:graphic xmlns:a="http://schemas.openxmlformats.org/drawingml/2006/main">
+              <a:graphicData uri="http://schemas.openxmlformats.org/drawingml/2006/picture">
+                <pic:pic xmlns:pic="http://schemas.openxmlformats.org/drawingml/2006/picture">
+                  <pic:nvPicPr>
+                    <pic:cNvPr id="1789299765" name="Picture 1" descr="A computer screen shot of a green bicycle&#10;&#10;AI-generated content may be incorrect."/>
+                    <pic:cNvPicPr/>
+                  </pic:nvPicPr>
+                  <pic:blipFill>
+                    <a:blip r:embed="rId7"/>
+                    <a:stretch>
+                      <a:fillRect/>
+                    </a:stretch>
+                  </pic:blipFill>
+                  <pic:spPr>
+                    <a:xfrm>
+                      <a:off x="0" y="0"/>
+                      <a:ext cx="5731510" cy="3157855"/>
+                    </a:xfrm>
+                    <a:prstGeom prst="rect">
+                      <a:avLst/>
+                    </a:prstGeom>
+                  </pic:spPr>
+                </pic:pic>
+              </a:graphicData>
+            </a:graphic>
+          </wp:inline>
+        </w:drawing>
       </w:r>
     </w:p>
     <w:sectPr>

</xml_diff>

<commit_message>
Final report base plan established
</commit_message>
<xml_diff>
--- a/Loose Info.docx
+++ b/Loose Info.docx
@@ -36,6 +36,11 @@
       </w:r>
     </w:p>
     <w:p>
+      <w:pPr>
+        <w:rPr>
+          <w:noProof/>
+        </w:rPr>
+      </w:pPr>
       <w:r>
         <w:rPr>
           <w:noProof/>
@@ -115,6 +120,28 @@
             </a:graphic>
           </wp:inline>
         </w:drawing>
+      </w:r>
+    </w:p>
+    <w:p>
+      <w:pPr>
+        <w:rPr>
+          <w:noProof/>
+        </w:rPr>
+      </w:pPr>
+      <w:hyperlink r:id="rId8" w:history="1">
+        <w:r>
+          <w:rPr>
+            <w:rStyle w:val="Hyperlink"/>
+            <w:noProof/>
+          </w:rPr>
+          <w:t>https://openpsychometrics.org/tests/IPIP-BFFM/</w:t>
+        </w:r>
+      </w:hyperlink>
+      <w:r>
+        <w:rPr>
+          <w:noProof/>
+        </w:rPr>
+        <w:t xml:space="preserve"> Personality Test Link</w:t>
       </w:r>
     </w:p>
     <w:sectPr>

</xml_diff>